<commit_message>
declaração de posse atualizado
</commit_message>
<xml_diff>
--- a/API-PHP/modelo_declaracao.docx
+++ b/API-PHP/modelo_declaracao.docx
@@ -19,7 +19,7 @@
           <w:sz w:val="28"/>
           <w:szCs w:val="28"/>
         </w:rPr>
-        <w:t>Declaração de posse e propriedade</w:t>
+        <w:t>DECLARAÇÃO DE RESPONSABILIDADE E POSSE</w:t>
       </w:r>
     </w:p>
     <w:p>
@@ -58,7 +58,7 @@
           <w:lang w:val="pt-BR"/>
           <w14:ligatures w14:val="standardContextual"/>
         </w:rPr>
-        <w:t>Eu, {{Proprietário}}, portador do CPF {{CPF_proprietario}} e do RG</w:t>
+        <w:t>Eu, {{Proprietário}}, portador do CPF</w:t>
       </w:r>
       <w:r>
         <w:rPr>
@@ -77,10 +77,44 @@
           <w:kern w:val="2"/>
           <w:sz w:val="24"/>
           <w:szCs w:val="24"/>
-          <w:lang w:val="pt-BR"/>
-          <w14:ligatures w14:val="standardContextual"/>
-        </w:rPr>
-        <w:t>{{RG-proprietario}}</w:t>
+          <w14:ligatures w14:val="standardContextual"/>
+        </w:rPr>
+        <w:t>sob o nº</w:t>
+      </w:r>
+      <w:r>
+        <w:rPr>
+          <w:rFonts w:asciiTheme="minorHAnsi" w:eastAsiaTheme="minorHAnsi" w:hAnsiTheme="minorHAnsi" w:cstheme="minorBidi"/>
+          <w:kern w:val="2"/>
+          <w:sz w:val="24"/>
+          <w:szCs w:val="24"/>
+          <w:lang w:val="pt-BR"/>
+          <w14:ligatures w14:val="standardContextual"/>
+        </w:rPr>
+        <w:t xml:space="preserve"> {{</w:t>
+      </w:r>
+      <w:proofErr w:type="spellStart"/>
+      <w:r>
+        <w:rPr>
+          <w:rFonts w:asciiTheme="minorHAnsi" w:eastAsiaTheme="minorHAnsi" w:hAnsiTheme="minorHAnsi" w:cstheme="minorBidi"/>
+          <w:kern w:val="2"/>
+          <w:sz w:val="24"/>
+          <w:szCs w:val="24"/>
+          <w:lang w:val="pt-BR"/>
+          <w14:ligatures w14:val="standardContextual"/>
+        </w:rPr>
+        <w:t>CPF_proprietario</w:t>
+      </w:r>
+      <w:proofErr w:type="spellEnd"/>
+      <w:r>
+        <w:rPr>
+          <w:rFonts w:asciiTheme="minorHAnsi" w:eastAsiaTheme="minorHAnsi" w:hAnsiTheme="minorHAnsi" w:cstheme="minorBidi"/>
+          <w:kern w:val="2"/>
+          <w:sz w:val="24"/>
+          <w:szCs w:val="24"/>
+          <w:lang w:val="pt-BR"/>
+          <w14:ligatures w14:val="standardContextual"/>
+        </w:rPr>
+        <w:t>}} e RG</w:t>
       </w:r>
       <w:r>
         <w:rPr>
@@ -99,10 +133,144 @@
           <w:kern w:val="2"/>
           <w:sz w:val="24"/>
           <w:szCs w:val="24"/>
-          <w:lang w:val="pt-BR"/>
-          <w14:ligatures w14:val="standardContextual"/>
-        </w:rPr>
-        <w:t>, solicito a Troca de Titularidade do ponto de fornecimento situado no endereço {{Endereco}}</w:t>
+          <w14:ligatures w14:val="standardContextual"/>
+        </w:rPr>
+        <w:t>nº</w:t>
+      </w:r>
+      <w:r>
+        <w:rPr>
+          <w:rFonts w:asciiTheme="minorHAnsi" w:eastAsiaTheme="minorHAnsi" w:hAnsiTheme="minorHAnsi" w:cstheme="minorBidi"/>
+          <w:kern w:val="2"/>
+          <w:sz w:val="24"/>
+          <w:szCs w:val="24"/>
+          <w:lang w:val="pt-BR"/>
+          <w14:ligatures w14:val="standardContextual"/>
+        </w:rPr>
+        <w:t xml:space="preserve"> </w:t>
+      </w:r>
+      <w:r>
+        <w:rPr>
+          <w:rFonts w:asciiTheme="minorHAnsi" w:eastAsiaTheme="minorHAnsi" w:hAnsiTheme="minorHAnsi" w:cstheme="minorBidi"/>
+          <w:kern w:val="2"/>
+          <w:sz w:val="24"/>
+          <w:szCs w:val="24"/>
+          <w:lang w:val="pt-BR"/>
+          <w14:ligatures w14:val="standardContextual"/>
+        </w:rPr>
+        <w:t>{{RG-</w:t>
+      </w:r>
+      <w:proofErr w:type="spellStart"/>
+      <w:r>
+        <w:rPr>
+          <w:rFonts w:asciiTheme="minorHAnsi" w:eastAsiaTheme="minorHAnsi" w:hAnsiTheme="minorHAnsi" w:cstheme="minorBidi"/>
+          <w:kern w:val="2"/>
+          <w:sz w:val="24"/>
+          <w:szCs w:val="24"/>
+          <w:lang w:val="pt-BR"/>
+          <w14:ligatures w14:val="standardContextual"/>
+        </w:rPr>
+        <w:t>proprietario</w:t>
+      </w:r>
+      <w:proofErr w:type="spellEnd"/>
+      <w:r>
+        <w:rPr>
+          <w:rFonts w:asciiTheme="minorHAnsi" w:eastAsiaTheme="minorHAnsi" w:hAnsiTheme="minorHAnsi" w:cstheme="minorBidi"/>
+          <w:kern w:val="2"/>
+          <w:sz w:val="24"/>
+          <w:szCs w:val="24"/>
+          <w:lang w:val="pt-BR"/>
+          <w14:ligatures w14:val="standardContextual"/>
+        </w:rPr>
+        <w:t>}}</w:t>
+      </w:r>
+      <w:r>
+        <w:rPr>
+          <w:rFonts w:asciiTheme="minorHAnsi" w:eastAsiaTheme="minorHAnsi" w:hAnsiTheme="minorHAnsi" w:cstheme="minorBidi"/>
+          <w:kern w:val="2"/>
+          <w:sz w:val="24"/>
+          <w:szCs w:val="24"/>
+          <w:lang w:val="pt-BR"/>
+          <w14:ligatures w14:val="standardContextual"/>
+        </w:rPr>
+        <w:t xml:space="preserve">, </w:t>
+      </w:r>
+      <w:r>
+        <w:rPr>
+          <w:rFonts w:asciiTheme="minorHAnsi" w:eastAsiaTheme="minorHAnsi" w:hAnsiTheme="minorHAnsi" w:cstheme="minorBidi"/>
+          <w:kern w:val="2"/>
+          <w:sz w:val="24"/>
+          <w:szCs w:val="24"/>
+          <w14:ligatures w14:val="standardContextual"/>
+        </w:rPr>
+        <w:t xml:space="preserve">declaro sob as penas da lei, em especial o </w:t>
+      </w:r>
+      <w:r>
+        <w:rPr>
+          <w:rFonts w:asciiTheme="minorHAnsi" w:eastAsiaTheme="minorHAnsi" w:hAnsiTheme="minorHAnsi" w:cstheme="minorBidi"/>
+          <w:b/>
+          <w:bCs/>
+          <w:kern w:val="2"/>
+          <w:sz w:val="24"/>
+          <w:szCs w:val="24"/>
+          <w14:ligatures w14:val="standardContextual"/>
+        </w:rPr>
+        <w:t>Artigo 299 do Código Penal</w:t>
+      </w:r>
+      <w:r>
+        <w:rPr>
+          <w:rFonts w:asciiTheme="minorHAnsi" w:eastAsiaTheme="minorHAnsi" w:hAnsiTheme="minorHAnsi" w:cstheme="minorBidi"/>
+          <w:kern w:val="2"/>
+          <w:sz w:val="24"/>
+          <w:szCs w:val="24"/>
+          <w14:ligatures w14:val="standardContextual"/>
+        </w:rPr>
+        <w:t>, que detenho a posse do imóvel situado no endereço</w:t>
+      </w:r>
+      <w:r>
+        <w:rPr>
+          <w:rFonts w:asciiTheme="minorHAnsi" w:eastAsiaTheme="minorHAnsi" w:hAnsiTheme="minorHAnsi" w:cstheme="minorBidi"/>
+          <w:kern w:val="2"/>
+          <w:sz w:val="24"/>
+          <w:szCs w:val="24"/>
+          <w:lang w:val="pt-BR"/>
+          <w14:ligatures w14:val="standardContextual"/>
+        </w:rPr>
+        <w:t xml:space="preserve"> </w:t>
+      </w:r>
+      <w:r>
+        <w:rPr>
+          <w:rFonts w:asciiTheme="minorHAnsi" w:eastAsiaTheme="minorHAnsi" w:hAnsiTheme="minorHAnsi" w:cstheme="minorBidi"/>
+          <w:kern w:val="2"/>
+          <w:sz w:val="24"/>
+          <w:szCs w:val="24"/>
+          <w:lang w:val="pt-BR"/>
+          <w14:ligatures w14:val="standardContextual"/>
+        </w:rPr>
+        <w:t>{{</w:t>
+      </w:r>
+      <w:proofErr w:type="spellStart"/>
+      <w:r>
+        <w:rPr>
+          <w:rFonts w:asciiTheme="minorHAnsi" w:eastAsiaTheme="minorHAnsi" w:hAnsiTheme="minorHAnsi" w:cstheme="minorBidi"/>
+          <w:kern w:val="2"/>
+          <w:sz w:val="24"/>
+          <w:szCs w:val="24"/>
+          <w:lang w:val="pt-BR"/>
+          <w14:ligatures w14:val="standardContextual"/>
+        </w:rPr>
+        <w:t>Endereco</w:t>
+      </w:r>
+      <w:proofErr w:type="spellEnd"/>
+      <w:r>
+        <w:rPr>
+          <w:rFonts w:asciiTheme="minorHAnsi" w:eastAsiaTheme="minorHAnsi" w:hAnsiTheme="minorHAnsi" w:cstheme="minorBidi"/>
+          <w:kern w:val="2"/>
+          <w:sz w:val="24"/>
+          <w:szCs w:val="24"/>
+          <w:lang w:val="pt-BR"/>
+          <w14:ligatures w14:val="standardContextual"/>
+        </w:rPr>
+        <w:t>}}</w:t>
       </w:r>
       <w:r>
         <w:rPr>
@@ -132,10 +300,55 @@
           <w:kern w:val="2"/>
           <w:sz w:val="24"/>
           <w:szCs w:val="24"/>
-          <w:lang w:val="pt-BR"/>
-          <w14:ligatures w14:val="standardContextual"/>
-        </w:rPr>
-        <w:t>e declaro sob as penas de lei, em especial o Artigo 299 do Código Peral, que sou responsável desde {{Inicio_permanencia}} que não possuo documento de propriedade ou posse do imóvel em meu nome, pelo motivo de {{Motivo}}.</w:t>
+          <w14:ligatures w14:val="standardContextual"/>
+        </w:rPr>
+        <w:t>de forma mansa e pacífica, desde</w:t>
+      </w:r>
+      <w:r>
+        <w:rPr>
+          <w:rFonts w:asciiTheme="minorHAnsi" w:eastAsiaTheme="minorHAnsi" w:hAnsiTheme="minorHAnsi" w:cstheme="minorBidi"/>
+          <w:kern w:val="2"/>
+          <w:sz w:val="24"/>
+          <w:szCs w:val="24"/>
+          <w:lang w:val="pt-BR"/>
+          <w14:ligatures w14:val="standardContextual"/>
+        </w:rPr>
+        <w:t xml:space="preserve"> {{</w:t>
+      </w:r>
+      <w:proofErr w:type="spellStart"/>
+      <w:r>
+        <w:rPr>
+          <w:rFonts w:asciiTheme="minorHAnsi" w:eastAsiaTheme="minorHAnsi" w:hAnsiTheme="minorHAnsi" w:cstheme="minorBidi"/>
+          <w:kern w:val="2"/>
+          <w:sz w:val="24"/>
+          <w:szCs w:val="24"/>
+          <w:lang w:val="pt-BR"/>
+          <w14:ligatures w14:val="standardContextual"/>
+        </w:rPr>
+        <w:t>Inicio_permanencia</w:t>
+      </w:r>
+      <w:proofErr w:type="spellEnd"/>
+      <w:r>
+        <w:rPr>
+          <w:rFonts w:asciiTheme="minorHAnsi" w:eastAsiaTheme="minorHAnsi" w:hAnsiTheme="minorHAnsi" w:cstheme="minorBidi"/>
+          <w:kern w:val="2"/>
+          <w:sz w:val="24"/>
+          <w:szCs w:val="24"/>
+          <w:lang w:val="pt-BR"/>
+          <w14:ligatures w14:val="standardContextual"/>
+        </w:rPr>
+        <w:t>}}</w:t>
+      </w:r>
+      <w:r>
+        <w:rPr>
+          <w:rFonts w:asciiTheme="minorHAnsi" w:eastAsiaTheme="minorHAnsi" w:hAnsiTheme="minorHAnsi" w:cstheme="minorBidi"/>
+          <w:kern w:val="2"/>
+          <w:sz w:val="24"/>
+          <w:szCs w:val="24"/>
+          <w:lang w:val="pt-BR"/>
+          <w14:ligatures w14:val="standardContextual"/>
+        </w:rPr>
+        <w:t>.</w:t>
       </w:r>
     </w:p>
     <w:p>
@@ -160,11 +373,178 @@
           <w:kern w:val="2"/>
           <w:sz w:val="24"/>
           <w:szCs w:val="24"/>
-          <w:lang w:val="pt-BR"/>
-          <w14:ligatures w14:val="standardContextual"/>
-        </w:rPr>
-        <w:t>Apresento juntamente a esta declaração o documento {{Nome_documento}} demonstrando o meu vínculo com o imóvel.</w:t>
-      </w:r>
+          <w14:ligatures w14:val="standardContextual"/>
+        </w:rPr>
+        <w:t>Declaro, ainda, que não possuo documento de propriedade (escritura ou registro) em meu nome pelo motivo de</w:t>
+      </w:r>
+      <w:r>
+        <w:rPr>
+          <w:rFonts w:asciiTheme="minorHAnsi" w:eastAsiaTheme="minorHAnsi" w:hAnsiTheme="minorHAnsi" w:cstheme="minorBidi"/>
+          <w:kern w:val="2"/>
+          <w:sz w:val="24"/>
+          <w:szCs w:val="24"/>
+          <w:lang w:val="pt-BR"/>
+          <w14:ligatures w14:val="standardContextual"/>
+        </w:rPr>
+        <w:t xml:space="preserve"> </w:t>
+      </w:r>
+      <w:r>
+        <w:rPr>
+          <w:rFonts w:asciiTheme="minorHAnsi" w:eastAsiaTheme="minorHAnsi" w:hAnsiTheme="minorHAnsi" w:cstheme="minorBidi"/>
+          <w:kern w:val="2"/>
+          <w:sz w:val="24"/>
+          <w:szCs w:val="24"/>
+          <w:lang w:val="pt-BR"/>
+          <w14:ligatures w14:val="standardContextual"/>
+        </w:rPr>
+        <w:t>{{Motivo}}</w:t>
+      </w:r>
+      <w:r>
+        <w:rPr>
+          <w:rFonts w:asciiTheme="minorHAnsi" w:eastAsiaTheme="minorHAnsi" w:hAnsiTheme="minorHAnsi" w:cstheme="minorBidi"/>
+          <w:kern w:val="2"/>
+          <w:sz w:val="24"/>
+          <w:szCs w:val="24"/>
+          <w14:ligatures w14:val="standardContextual"/>
+        </w:rPr>
+        <w:t>, e que sou o responsável legal pelo uso e manutenção do referido imóvel.</w:t>
+      </w:r>
+    </w:p>
+    <w:p>
+      <w:pPr>
+        <w:widowControl/>
+        <w:autoSpaceDE/>
+        <w:autoSpaceDN/>
+        <w:spacing w:after="160" w:line="278" w:lineRule="auto"/>
+        <w:jc w:val="both"/>
+        <w:rPr>
+          <w:rFonts w:asciiTheme="minorHAnsi" w:eastAsiaTheme="minorHAnsi" w:hAnsiTheme="minorHAnsi" w:cstheme="minorBidi"/>
+          <w:kern w:val="2"/>
+          <w:lang w:val="pt-BR"/>
+          <w14:ligatures w14:val="standardContextual"/>
+        </w:rPr>
+      </w:pPr>
+      <w:r>
+        <w:rPr>
+          <w:rFonts w:asciiTheme="minorHAnsi" w:eastAsiaTheme="minorHAnsi" w:hAnsiTheme="minorHAnsi" w:cstheme="minorBidi"/>
+          <w:kern w:val="2"/>
+          <w:sz w:val="24"/>
+          <w:szCs w:val="24"/>
+          <w14:ligatures w14:val="standardContextual"/>
+        </w:rPr>
+        <w:t>Apresento, juntamente a esta declaração, o documento</w:t>
+      </w:r>
+      <w:r>
+        <w:rPr>
+          <w:rFonts w:asciiTheme="minorHAnsi" w:eastAsiaTheme="minorHAnsi" w:hAnsiTheme="minorHAnsi" w:cstheme="minorBidi"/>
+          <w:kern w:val="2"/>
+          <w:sz w:val="24"/>
+          <w:szCs w:val="24"/>
+          <w:lang w:val="pt-BR"/>
+          <w14:ligatures w14:val="standardContextual"/>
+        </w:rPr>
+        <w:t xml:space="preserve"> </w:t>
+      </w:r>
+      <w:r>
+        <w:rPr>
+          <w:rFonts w:asciiTheme="minorHAnsi" w:eastAsiaTheme="minorHAnsi" w:hAnsiTheme="minorHAnsi" w:cstheme="minorBidi"/>
+          <w:kern w:val="2"/>
+          <w:sz w:val="24"/>
+          <w:szCs w:val="24"/>
+          <w:lang w:val="pt-BR"/>
+          <w14:ligatures w14:val="standardContextual"/>
+        </w:rPr>
+        <w:t>{{</w:t>
+      </w:r>
+      <w:proofErr w:type="spellStart"/>
+      <w:r>
+        <w:rPr>
+          <w:rFonts w:asciiTheme="minorHAnsi" w:eastAsiaTheme="minorHAnsi" w:hAnsiTheme="minorHAnsi" w:cstheme="minorBidi"/>
+          <w:kern w:val="2"/>
+          <w:sz w:val="24"/>
+          <w:szCs w:val="24"/>
+          <w:lang w:val="pt-BR"/>
+          <w14:ligatures w14:val="standardContextual"/>
+        </w:rPr>
+        <w:t>Nome_documento</w:t>
+      </w:r>
+      <w:proofErr w:type="spellEnd"/>
+      <w:r>
+        <w:rPr>
+          <w:rFonts w:asciiTheme="minorHAnsi" w:eastAsiaTheme="minorHAnsi" w:hAnsiTheme="minorHAnsi" w:cstheme="minorBidi"/>
+          <w:kern w:val="2"/>
+          <w:sz w:val="24"/>
+          <w:szCs w:val="24"/>
+          <w:lang w:val="pt-BR"/>
+          <w14:ligatures w14:val="standardContextual"/>
+        </w:rPr>
+        <w:t>}}</w:t>
+      </w:r>
+      <w:r>
+        <w:rPr>
+          <w:rFonts w:asciiTheme="minorHAnsi" w:eastAsiaTheme="minorHAnsi" w:hAnsiTheme="minorHAnsi" w:cstheme="minorBidi"/>
+          <w:kern w:val="2"/>
+          <w:sz w:val="24"/>
+          <w:szCs w:val="24"/>
+          <w:lang w:val="pt-BR"/>
+          <w14:ligatures w14:val="standardContextual"/>
+        </w:rPr>
+        <w:t xml:space="preserve"> </w:t>
+      </w:r>
+      <w:r>
+        <w:rPr>
+          <w:rFonts w:asciiTheme="minorHAnsi" w:eastAsiaTheme="minorHAnsi" w:hAnsiTheme="minorHAnsi" w:cstheme="minorBidi"/>
+          <w:kern w:val="2"/>
+          <w:lang w:val="pt-BR"/>
+          <w14:ligatures w14:val="standardContextual"/>
+        </w:rPr>
+        <w:t>para demonstrar o meu vínculo com o local.</w:t>
+      </w:r>
+    </w:p>
+    <w:p>
+      <w:pPr>
+        <w:widowControl/>
+        <w:autoSpaceDE/>
+        <w:autoSpaceDN/>
+        <w:spacing w:after="160" w:line="278" w:lineRule="auto"/>
+        <w:jc w:val="both"/>
+        <w:rPr>
+          <w:rFonts w:asciiTheme="minorHAnsi" w:eastAsiaTheme="minorHAnsi" w:hAnsiTheme="minorHAnsi" w:cstheme="minorBidi"/>
+          <w:kern w:val="2"/>
+          <w:sz w:val="24"/>
+          <w:szCs w:val="24"/>
+          <w:lang w:val="pt-BR"/>
+          <w14:ligatures w14:val="standardContextual"/>
+        </w:rPr>
+      </w:pPr>
+      <w:r>
+        <w:rPr>
+          <w:rFonts w:asciiTheme="minorHAnsi" w:eastAsiaTheme="minorHAnsi" w:hAnsiTheme="minorHAnsi" w:cstheme="minorBidi"/>
+          <w:kern w:val="2"/>
+          <w:sz w:val="24"/>
+          <w:szCs w:val="24"/>
+          <w:lang w:val="pt-BR"/>
+          <w14:ligatures w14:val="standardContextual"/>
+        </w:rPr>
+        <w:t>Por ser a expressão da verdade, firmo a presente.</w:t>
+      </w:r>
+    </w:p>
+    <w:p>
+      <w:pPr>
+        <w:widowControl/>
+        <w:autoSpaceDE/>
+        <w:autoSpaceDN/>
+        <w:spacing w:after="160" w:line="278" w:lineRule="auto"/>
+        <w:jc w:val="both"/>
+        <w:rPr>
+          <w:rFonts w:asciiTheme="minorHAnsi" w:eastAsiaTheme="minorHAnsi" w:hAnsiTheme="minorHAnsi" w:cstheme="minorBidi"/>
+          <w:kern w:val="2"/>
+          <w:sz w:val="24"/>
+          <w:szCs w:val="24"/>
+          <w:lang w:val="pt-BR"/>
+          <w14:ligatures w14:val="standardContextual"/>
+        </w:rPr>
+      </w:pPr>
     </w:p>
     <w:p>
       <w:pPr>
@@ -921,7 +1301,6 @@
   <w:style w:type="character" w:default="1" w:styleId="Fontepargpadro">
     <w:name w:val="Default Paragraph Font"/>
     <w:uiPriority w:val="1"/>
-    <w:semiHidden/>
     <w:unhideWhenUsed/>
   </w:style>
   <w:style w:type="table" w:default="1" w:styleId="Tabelanormal">
@@ -1006,6 +1385,19 @@
       <w:spacing w:line="190" w:lineRule="exact"/>
       <w:ind w:left="107"/>
     </w:pPr>
+  </w:style>
+  <w:style w:type="paragraph" w:styleId="NormalWeb">
+    <w:name w:val="Normal (Web)"/>
+    <w:basedOn w:val="Normal"/>
+    <w:uiPriority w:val="99"/>
+    <w:semiHidden/>
+    <w:unhideWhenUsed/>
+    <w:rsid w:val="00AE2119"/>
+    <w:rPr>
+      <w:rFonts w:ascii="Times New Roman" w:hAnsi="Times New Roman" w:cs="Times New Roman"/>
+      <w:sz w:val="24"/>
+      <w:szCs w:val="24"/>
+    </w:rPr>
   </w:style>
 </w:styles>
 </file>

</xml_diff>

<commit_message>
fix placeholder e modelo
</commit_message>
<xml_diff>
--- a/API-PHP/modelo_declaracao.docx
+++ b/API-PHP/modelo_declaracao.docx
@@ -90,31 +90,7 @@
           <w:lang w:val="pt-BR"/>
           <w14:ligatures w14:val="standardContextual"/>
         </w:rPr>
-        <w:t xml:space="preserve"> {{</w:t>
-      </w:r>
-      <w:proofErr w:type="spellStart"/>
-      <w:r>
-        <w:rPr>
-          <w:rFonts w:asciiTheme="minorHAnsi" w:eastAsiaTheme="minorHAnsi" w:hAnsiTheme="minorHAnsi" w:cstheme="minorBidi"/>
-          <w:kern w:val="2"/>
-          <w:sz w:val="24"/>
-          <w:szCs w:val="24"/>
-          <w:lang w:val="pt-BR"/>
-          <w14:ligatures w14:val="standardContextual"/>
-        </w:rPr>
-        <w:t>CPF_proprietario</w:t>
-      </w:r>
-      <w:proofErr w:type="spellEnd"/>
-      <w:r>
-        <w:rPr>
-          <w:rFonts w:asciiTheme="minorHAnsi" w:eastAsiaTheme="minorHAnsi" w:hAnsiTheme="minorHAnsi" w:cstheme="minorBidi"/>
-          <w:kern w:val="2"/>
-          <w:sz w:val="24"/>
-          <w:szCs w:val="24"/>
-          <w:lang w:val="pt-BR"/>
-          <w14:ligatures w14:val="standardContextual"/>
-        </w:rPr>
-        <w:t>}} e RG</w:t>
+        <w:t xml:space="preserve"> {{CPF_proprietario}} e RG</w:t>
       </w:r>
       <w:r>
         <w:rPr>
@@ -146,21 +122,30 @@
           <w:lang w:val="pt-BR"/>
           <w14:ligatures w14:val="standardContextual"/>
         </w:rPr>
-        <w:t xml:space="preserve"> {{RG-</w:t>
-      </w:r>
-      <w:proofErr w:type="spellStart"/>
-      <w:r>
-        <w:rPr>
-          <w:rFonts w:asciiTheme="minorHAnsi" w:eastAsiaTheme="minorHAnsi" w:hAnsiTheme="minorHAnsi" w:cstheme="minorBidi"/>
-          <w:kern w:val="2"/>
-          <w:sz w:val="24"/>
-          <w:szCs w:val="24"/>
-          <w:lang w:val="pt-BR"/>
-          <w14:ligatures w14:val="standardContextual"/>
-        </w:rPr>
-        <w:t>proprietario</w:t>
-      </w:r>
-      <w:proofErr w:type="spellEnd"/>
+        <w:t xml:space="preserve"> </w:t>
+      </w:r>
+      <w:r>
+        <w:rPr>
+          <w:rFonts w:asciiTheme="minorHAnsi" w:eastAsiaTheme="minorHAnsi" w:hAnsiTheme="minorHAnsi" w:cstheme="minorBidi"/>
+          <w:kern w:val="2"/>
+          <w:sz w:val="24"/>
+          <w:szCs w:val="24"/>
+          <w:lang w:val="pt-BR"/>
+          <w14:ligatures w14:val="standardContextual"/>
+        </w:rPr>
+        <w:t>{{</w:t>
+      </w:r>
+      <w:r>
+        <w:rPr>
+          <w:rFonts w:asciiTheme="minorHAnsi" w:eastAsiaTheme="minorHAnsi" w:hAnsiTheme="minorHAnsi" w:cstheme="minorBidi"/>
+          <w:kern w:val="2"/>
+          <w:sz w:val="24"/>
+          <w:szCs w:val="24"/>
+          <w:lang w:val="pt-BR"/>
+          <w14:ligatures w14:val="standardContextual"/>
+        </w:rPr>
+        <w:t>RG-proprietario</w:t>
+      </w:r>
       <w:r>
         <w:rPr>
           <w:rFonts w:asciiTheme="minorHAnsi" w:eastAsiaTheme="minorHAnsi" w:hAnsiTheme="minorHAnsi" w:cstheme="minorBidi"/>
@@ -171,6 +156,17 @@
           <w14:ligatures w14:val="standardContextual"/>
         </w:rPr>
         <w:t>}}</w:t>
+      </w:r>
+      <w:r>
+        <w:rPr>
+          <w:rFonts w:asciiTheme="minorHAnsi" w:eastAsiaTheme="minorHAnsi" w:hAnsiTheme="minorHAnsi" w:cstheme="minorBidi"/>
+          <w:kern w:val="2"/>
+          <w:sz w:val="24"/>
+          <w:szCs w:val="24"/>
+          <w:lang w:val="pt-BR"/>
+          <w14:ligatures w14:val="standardContextual"/>
+        </w:rPr>
+        <w:t xml:space="preserve"> </w:t>
       </w:r>
       <w:r>
         <w:rPr>
@@ -235,31 +231,7 @@
           <w:lang w:val="pt-BR"/>
           <w14:ligatures w14:val="standardContextual"/>
         </w:rPr>
-        <w:t>{{</w:t>
-      </w:r>
-      <w:proofErr w:type="spellStart"/>
-      <w:r>
-        <w:rPr>
-          <w:rFonts w:asciiTheme="minorHAnsi" w:eastAsiaTheme="minorHAnsi" w:hAnsiTheme="minorHAnsi" w:cstheme="minorBidi"/>
-          <w:kern w:val="2"/>
-          <w:sz w:val="24"/>
-          <w:szCs w:val="24"/>
-          <w:lang w:val="pt-BR"/>
-          <w14:ligatures w14:val="standardContextual"/>
-        </w:rPr>
-        <w:t>Endereco</w:t>
-      </w:r>
-      <w:proofErr w:type="spellEnd"/>
-      <w:r>
-        <w:rPr>
-          <w:rFonts w:asciiTheme="minorHAnsi" w:eastAsiaTheme="minorHAnsi" w:hAnsiTheme="minorHAnsi" w:cstheme="minorBidi"/>
-          <w:kern w:val="2"/>
-          <w:sz w:val="24"/>
-          <w:szCs w:val="24"/>
-          <w:lang w:val="pt-BR"/>
-          <w14:ligatures w14:val="standardContextual"/>
-        </w:rPr>
-        <w:t>}}</w:t>
+        <w:t>{{Endereco}}</w:t>
       </w:r>
       <w:r>
         <w:rPr>
@@ -302,31 +274,7 @@
           <w:lang w:val="pt-BR"/>
           <w14:ligatures w14:val="standardContextual"/>
         </w:rPr>
-        <w:t xml:space="preserve"> {{</w:t>
-      </w:r>
-      <w:proofErr w:type="spellStart"/>
-      <w:r>
-        <w:rPr>
-          <w:rFonts w:asciiTheme="minorHAnsi" w:eastAsiaTheme="minorHAnsi" w:hAnsiTheme="minorHAnsi" w:cstheme="minorBidi"/>
-          <w:kern w:val="2"/>
-          <w:sz w:val="24"/>
-          <w:szCs w:val="24"/>
-          <w:lang w:val="pt-BR"/>
-          <w14:ligatures w14:val="standardContextual"/>
-        </w:rPr>
-        <w:t>Inicio_permanencia</w:t>
-      </w:r>
-      <w:proofErr w:type="spellEnd"/>
-      <w:r>
-        <w:rPr>
-          <w:rFonts w:asciiTheme="minorHAnsi" w:eastAsiaTheme="minorHAnsi" w:hAnsiTheme="minorHAnsi" w:cstheme="minorBidi"/>
-          <w:kern w:val="2"/>
-          <w:sz w:val="24"/>
-          <w:szCs w:val="24"/>
-          <w:lang w:val="pt-BR"/>
-          <w14:ligatures w14:val="standardContextual"/>
-        </w:rPr>
-        <w:t>}}</w:t>
+        <w:t xml:space="preserve"> {{Inicio_permanencia}}</w:t>
       </w:r>
       <w:r>
         <w:rPr>
@@ -443,31 +391,7 @@
           <w:lang w:val="pt-BR"/>
           <w14:ligatures w14:val="standardContextual"/>
         </w:rPr>
-        <w:t>{{</w:t>
-      </w:r>
-      <w:proofErr w:type="spellStart"/>
-      <w:r>
-        <w:rPr>
-          <w:rFonts w:asciiTheme="minorHAnsi" w:eastAsiaTheme="minorHAnsi" w:hAnsiTheme="minorHAnsi" w:cstheme="minorBidi"/>
-          <w:kern w:val="2"/>
-          <w:sz w:val="24"/>
-          <w:szCs w:val="24"/>
-          <w:lang w:val="pt-BR"/>
-          <w14:ligatures w14:val="standardContextual"/>
-        </w:rPr>
-        <w:t>Nome_documento</w:t>
-      </w:r>
-      <w:proofErr w:type="spellEnd"/>
-      <w:r>
-        <w:rPr>
-          <w:rFonts w:asciiTheme="minorHAnsi" w:eastAsiaTheme="minorHAnsi" w:hAnsiTheme="minorHAnsi" w:cstheme="minorBidi"/>
-          <w:kern w:val="2"/>
-          <w:sz w:val="24"/>
-          <w:szCs w:val="24"/>
-          <w:lang w:val="pt-BR"/>
-          <w14:ligatures w14:val="standardContextual"/>
-        </w:rPr>
-        <w:t>}}</w:t>
+        <w:t>{{Nome_documento}}</w:t>
       </w:r>
       <w:r>
         <w:rPr>
@@ -1290,7 +1214,6 @@
   <w:style w:type="character" w:default="1" w:styleId="Fontepargpadro">
     <w:name w:val="Default Paragraph Font"/>
     <w:uiPriority w:val="1"/>
-    <w:semiHidden/>
     <w:unhideWhenUsed/>
   </w:style>
   <w:style w:type="table" w:default="1" w:styleId="Tabelanormal">

</xml_diff>

<commit_message>
atualização da norma da declaração de posse
</commit_message>
<xml_diff>
--- a/API-PHP/modelo_declaracao.docx
+++ b/API-PHP/modelo_declaracao.docx
@@ -155,18 +155,7 @@
           <w:lang w:val="pt-BR"/>
           <w14:ligatures w14:val="standardContextual"/>
         </w:rPr>
-        <w:t>}}</w:t>
-      </w:r>
-      <w:r>
-        <w:rPr>
-          <w:rFonts w:asciiTheme="minorHAnsi" w:eastAsiaTheme="minorHAnsi" w:hAnsiTheme="minorHAnsi" w:cstheme="minorBidi"/>
-          <w:kern w:val="2"/>
-          <w:sz w:val="24"/>
-          <w:szCs w:val="24"/>
-          <w:lang w:val="pt-BR"/>
-          <w14:ligatures w14:val="standardContextual"/>
-        </w:rPr>
-        <w:t xml:space="preserve"> </w:t>
+        <w:t xml:space="preserve">}} </w:t>
       </w:r>
       <w:r>
         <w:rPr>
@@ -310,41 +299,10 @@
           <w:kern w:val="2"/>
           <w:sz w:val="24"/>
           <w:szCs w:val="24"/>
-          <w14:ligatures w14:val="standardContextual"/>
-        </w:rPr>
-        <w:t>Declaro, ainda, que não possuo documento de propriedade (escritura ou registro) em meu nome pelo motivo de</w:t>
-      </w:r>
-      <w:r>
-        <w:rPr>
-          <w:rFonts w:asciiTheme="minorHAnsi" w:eastAsiaTheme="minorHAnsi" w:hAnsiTheme="minorHAnsi" w:cstheme="minorBidi"/>
-          <w:kern w:val="2"/>
-          <w:sz w:val="24"/>
-          <w:szCs w:val="24"/>
-          <w:lang w:val="pt-BR"/>
-          <w14:ligatures w14:val="standardContextual"/>
-        </w:rPr>
-        <w:t xml:space="preserve"> </w:t>
-      </w:r>
-      <w:r>
-        <w:rPr>
-          <w:rFonts w:asciiTheme="minorHAnsi" w:eastAsiaTheme="minorHAnsi" w:hAnsiTheme="minorHAnsi" w:cstheme="minorBidi"/>
-          <w:kern w:val="2"/>
-          <w:sz w:val="24"/>
-          <w:szCs w:val="24"/>
-          <w:lang w:val="pt-BR"/>
-          <w14:ligatures w14:val="standardContextual"/>
-        </w:rPr>
-        <w:t>{{Motivo}}</w:t>
-      </w:r>
-      <w:r>
-        <w:rPr>
-          <w:rFonts w:asciiTheme="minorHAnsi" w:eastAsiaTheme="minorHAnsi" w:hAnsiTheme="minorHAnsi" w:cstheme="minorBidi"/>
-          <w:kern w:val="2"/>
-          <w:sz w:val="24"/>
-          <w:szCs w:val="24"/>
-          <w14:ligatures w14:val="standardContextual"/>
-        </w:rPr>
-        <w:t>, e que sou o responsável legal pelo uso e manutenção do referido imóvel.</w:t>
+          <w:lang w:val="pt-BR"/>
+          <w14:ligatures w14:val="standardContextual"/>
+        </w:rPr>
+        <w:t>Declaro, ainda, que sou o responsável legal pelo uso e manutenção do referido imóvel.</w:t>
       </w:r>
     </w:p>
     <w:p>
@@ -391,7 +349,7 @@
           <w:lang w:val="pt-BR"/>
           <w14:ligatures w14:val="standardContextual"/>
         </w:rPr>
-        <w:t>{{Nome_documento}}</w:t>
+        <w:t>{{CPF_proprietario}}</w:t>
       </w:r>
       <w:r>
         <w:rPr>
@@ -1214,6 +1172,7 @@
   <w:style w:type="character" w:default="1" w:styleId="Fontepargpadro">
     <w:name w:val="Default Paragraph Font"/>
     <w:uiPriority w:val="1"/>
+    <w:semiHidden/>
     <w:unhideWhenUsed/>
   </w:style>
   <w:style w:type="table" w:default="1" w:styleId="Tabelanormal">

</xml_diff>

<commit_message>
Substituída conversão de Buffer por doc.output('blob') nativo para evitar PDFs em branco no cliente.
Implementado pré-carregamento assíncrono de imagens (Logo e Avatar) com fetch e FileReader.

Adicionada key dinâmica nos inputs de perfil para forçar atualização visual após o upsert.

Melhorias de UI no PDF: novo gráfico de geração, box de investimento destacado e assinatura com foto do consultor.

Adicionado force-dynamic na página de listagem de propostas para evitar cache estático.
</commit_message>
<xml_diff>
--- a/API-PHP/modelo_declaracao.docx
+++ b/API-PHP/modelo_declaracao.docx
@@ -7,20 +7,55 @@
         <w:jc w:val="center"/>
         <w:rPr>
           <w:b/>
-          <w:bCs/>
-          <w:sz w:val="28"/>
-          <w:szCs w:val="28"/>
-        </w:rPr>
-      </w:pPr>
-      <w:r>
+        </w:rPr>
+      </w:pPr>
+    </w:p>
+    <w:p>
+      <w:pPr>
+        <w:jc w:val="center"/>
+        <w:rPr>
+          <w:b/>
+        </w:rPr>
+      </w:pPr>
+      <w:r>
+        <w:rPr>
+          <w:b/>
+        </w:rPr>
+        <w:t>DECLARAÇÃO DE VÍNCULO E RESPONSABILIDADE SOBRE UNIDADE CONSUMIDORA</w:t>
+      </w:r>
+    </w:p>
+    <w:p>
+      <w:pPr>
+        <w:jc w:val="center"/>
         <w:rPr>
           <w:b/>
           <w:bCs/>
           <w:sz w:val="28"/>
           <w:szCs w:val="28"/>
         </w:rPr>
-        <w:t>DECLARAÇÃO DE RESPONSABILIDADE E POSSE</w:t>
-      </w:r>
+      </w:pPr>
+    </w:p>
+    <w:p>
+      <w:pPr>
+        <w:jc w:val="center"/>
+        <w:rPr>
+          <w:b/>
+          <w:bCs/>
+          <w:sz w:val="28"/>
+          <w:szCs w:val="28"/>
+        </w:rPr>
+      </w:pPr>
+    </w:p>
+    <w:p>
+      <w:pPr>
+        <w:jc w:val="center"/>
+        <w:rPr>
+          <w:b/>
+          <w:bCs/>
+          <w:sz w:val="28"/>
+          <w:szCs w:val="28"/>
+        </w:rPr>
+      </w:pPr>
     </w:p>
     <w:p>
       <w:pPr>
@@ -50,47 +85,38 @@
         </w:rPr>
       </w:pPr>
       <w:r>
-        <w:rPr>
-          <w:rFonts w:asciiTheme="minorHAnsi" w:eastAsiaTheme="minorHAnsi" w:hAnsiTheme="minorHAnsi" w:cstheme="minorBidi"/>
-          <w:kern w:val="2"/>
-          <w:sz w:val="24"/>
-          <w:szCs w:val="24"/>
-          <w:lang w:val="pt-BR"/>
-          <w14:ligatures w14:val="standardContextual"/>
-        </w:rPr>
-        <w:t>Eu, {{Proprietário}}, portador do CPF</w:t>
-      </w:r>
-      <w:r>
-        <w:rPr>
-          <w:rFonts w:asciiTheme="minorHAnsi" w:eastAsiaTheme="minorHAnsi" w:hAnsiTheme="minorHAnsi" w:cstheme="minorBidi"/>
-          <w:kern w:val="2"/>
-          <w:sz w:val="24"/>
-          <w:szCs w:val="24"/>
-          <w:lang w:val="pt-BR"/>
-          <w14:ligatures w14:val="standardContextual"/>
-        </w:rPr>
+        <w:t xml:space="preserve">Eu, {{Proprietário}}, </w:t>
+      </w:r>
+      <w:r>
+        <w:t xml:space="preserve">portador(a) do CPF nº </w:t>
+      </w:r>
+      <w:r>
+        <w:t>{{</w:t>
+      </w:r>
+      <w:proofErr w:type="spellStart"/>
+      <w:r>
+        <w:t>CPF_proprietario</w:t>
+      </w:r>
+      <w:proofErr w:type="spellEnd"/>
+      <w:r>
+        <w:t>}} e RG</w:t>
+      </w:r>
+      <w:r>
+        <w:t xml:space="preserve"> nº</w:t>
+      </w:r>
+      <w:r>
         <w:t xml:space="preserve"> </w:t>
       </w:r>
       <w:r>
-        <w:rPr>
-          <w:rFonts w:asciiTheme="minorHAnsi" w:eastAsiaTheme="minorHAnsi" w:hAnsiTheme="minorHAnsi" w:cstheme="minorBidi"/>
-          <w:kern w:val="2"/>
-          <w:sz w:val="24"/>
-          <w:szCs w:val="24"/>
-          <w14:ligatures w14:val="standardContextual"/>
-        </w:rPr>
-        <w:t>sob o nº</w:t>
-      </w:r>
-      <w:r>
-        <w:rPr>
-          <w:rFonts w:asciiTheme="minorHAnsi" w:eastAsiaTheme="minorHAnsi" w:hAnsiTheme="minorHAnsi" w:cstheme="minorBidi"/>
-          <w:kern w:val="2"/>
-          <w:sz w:val="24"/>
-          <w:szCs w:val="24"/>
-          <w:lang w:val="pt-BR"/>
-          <w14:ligatures w14:val="standardContextual"/>
-        </w:rPr>
-        <w:t xml:space="preserve"> {{CPF_proprietario}} e RG</w:t>
+        <w:t>{{RG-</w:t>
+      </w:r>
+      <w:proofErr w:type="spellStart"/>
+      <w:r>
+        <w:t>proprietario</w:t>
+      </w:r>
+      <w:proofErr w:type="spellEnd"/>
+      <w:r>
+        <w:t>}}</w:t>
       </w:r>
       <w:r>
         <w:rPr>
@@ -104,14 +130,7 @@
         <w:t xml:space="preserve"> </w:t>
       </w:r>
       <w:r>
-        <w:rPr>
-          <w:rFonts w:asciiTheme="minorHAnsi" w:eastAsiaTheme="minorHAnsi" w:hAnsiTheme="minorHAnsi" w:cstheme="minorBidi"/>
-          <w:kern w:val="2"/>
-          <w:sz w:val="24"/>
-          <w:szCs w:val="24"/>
-          <w14:ligatures w14:val="standardContextual"/>
-        </w:rPr>
-        <w:t>nº</w:t>
+        <w:t>declaro, para os devidos fins, que mantenho vínculo de utilização/ ocupação/ responsabilidade operacional ou autorização de uso referente ao imóvel/unidade consumidora situada na</w:t>
       </w:r>
       <w:r>
         <w:rPr>
@@ -135,27 +154,29 @@
         </w:rPr>
         <w:t>{{</w:t>
       </w:r>
-      <w:r>
-        <w:rPr>
-          <w:rFonts w:asciiTheme="minorHAnsi" w:eastAsiaTheme="minorHAnsi" w:hAnsiTheme="minorHAnsi" w:cstheme="minorBidi"/>
-          <w:kern w:val="2"/>
-          <w:sz w:val="24"/>
-          <w:szCs w:val="24"/>
-          <w:lang w:val="pt-BR"/>
-          <w14:ligatures w14:val="standardContextual"/>
-        </w:rPr>
-        <w:t>RG-proprietario</w:t>
-      </w:r>
-      <w:r>
-        <w:rPr>
-          <w:rFonts w:asciiTheme="minorHAnsi" w:eastAsiaTheme="minorHAnsi" w:hAnsiTheme="minorHAnsi" w:cstheme="minorBidi"/>
-          <w:kern w:val="2"/>
-          <w:sz w:val="24"/>
-          <w:szCs w:val="24"/>
-          <w:lang w:val="pt-BR"/>
-          <w14:ligatures w14:val="standardContextual"/>
-        </w:rPr>
-        <w:t xml:space="preserve">}} </w:t>
+      <w:proofErr w:type="spellStart"/>
+      <w:r>
+        <w:rPr>
+          <w:rFonts w:asciiTheme="minorHAnsi" w:eastAsiaTheme="minorHAnsi" w:hAnsiTheme="minorHAnsi" w:cstheme="minorBidi"/>
+          <w:kern w:val="2"/>
+          <w:sz w:val="24"/>
+          <w:szCs w:val="24"/>
+          <w:lang w:val="pt-BR"/>
+          <w14:ligatures w14:val="standardContextual"/>
+        </w:rPr>
+        <w:t>Endereco</w:t>
+      </w:r>
+      <w:proofErr w:type="spellEnd"/>
+      <w:r>
+        <w:rPr>
+          <w:rFonts w:asciiTheme="minorHAnsi" w:eastAsiaTheme="minorHAnsi" w:hAnsiTheme="minorHAnsi" w:cstheme="minorBidi"/>
+          <w:kern w:val="2"/>
+          <w:sz w:val="24"/>
+          <w:szCs w:val="24"/>
+          <w:lang w:val="pt-BR"/>
+          <w14:ligatures w14:val="standardContextual"/>
+        </w:rPr>
+        <w:t>}}</w:t>
       </w:r>
       <w:r>
         <w:rPr>
@@ -174,96 +195,10 @@
           <w:kern w:val="2"/>
           <w:sz w:val="24"/>
           <w:szCs w:val="24"/>
-          <w14:ligatures w14:val="standardContextual"/>
-        </w:rPr>
-        <w:t xml:space="preserve">declaro sob as penas da lei, em especial o </w:t>
-      </w:r>
-      <w:r>
-        <w:rPr>
-          <w:rFonts w:asciiTheme="minorHAnsi" w:eastAsiaTheme="minorHAnsi" w:hAnsiTheme="minorHAnsi" w:cstheme="minorBidi"/>
-          <w:b/>
-          <w:bCs/>
-          <w:kern w:val="2"/>
-          <w:sz w:val="24"/>
-          <w:szCs w:val="24"/>
-          <w14:ligatures w14:val="standardContextual"/>
-        </w:rPr>
-        <w:t>Artigo 299 do Código Penal</w:t>
-      </w:r>
-      <w:r>
-        <w:rPr>
-          <w:rFonts w:asciiTheme="minorHAnsi" w:eastAsiaTheme="minorHAnsi" w:hAnsiTheme="minorHAnsi" w:cstheme="minorBidi"/>
-          <w:kern w:val="2"/>
-          <w:sz w:val="24"/>
-          <w:szCs w:val="24"/>
-          <w14:ligatures w14:val="standardContextual"/>
-        </w:rPr>
-        <w:t>, que detenho a posse do imóvel situado no endereço</w:t>
-      </w:r>
-      <w:r>
-        <w:rPr>
-          <w:rFonts w:asciiTheme="minorHAnsi" w:eastAsiaTheme="minorHAnsi" w:hAnsiTheme="minorHAnsi" w:cstheme="minorBidi"/>
-          <w:kern w:val="2"/>
-          <w:sz w:val="24"/>
-          <w:szCs w:val="24"/>
-          <w:lang w:val="pt-BR"/>
-          <w14:ligatures w14:val="standardContextual"/>
-        </w:rPr>
-        <w:t xml:space="preserve"> </w:t>
-      </w:r>
-      <w:r>
-        <w:rPr>
-          <w:rFonts w:asciiTheme="minorHAnsi" w:eastAsiaTheme="minorHAnsi" w:hAnsiTheme="minorHAnsi" w:cstheme="minorBidi"/>
-          <w:kern w:val="2"/>
-          <w:sz w:val="24"/>
-          <w:szCs w:val="24"/>
-          <w:lang w:val="pt-BR"/>
-          <w14:ligatures w14:val="standardContextual"/>
-        </w:rPr>
-        <w:t>{{Endereco}}</w:t>
-      </w:r>
-      <w:r>
-        <w:rPr>
-          <w:rFonts w:asciiTheme="minorHAnsi" w:eastAsiaTheme="minorHAnsi" w:hAnsiTheme="minorHAnsi" w:cstheme="minorBidi"/>
-          <w:kern w:val="2"/>
-          <w:sz w:val="24"/>
-          <w:szCs w:val="24"/>
-          <w:lang w:val="pt-BR"/>
-          <w14:ligatures w14:val="standardContextual"/>
-        </w:rPr>
-        <w:t xml:space="preserve">, </w:t>
-      </w:r>
-      <w:r>
-        <w:rPr>
-          <w:rFonts w:asciiTheme="minorHAnsi" w:eastAsiaTheme="minorHAnsi" w:hAnsiTheme="minorHAnsi" w:cstheme="minorBidi"/>
-          <w:kern w:val="2"/>
-          <w:sz w:val="24"/>
-          <w:szCs w:val="24"/>
-          <w:lang w:val="pt-BR"/>
-          <w14:ligatures w14:val="standardContextual"/>
-        </w:rPr>
-        <w:t xml:space="preserve">{{Complemento}} </w:t>
-      </w:r>
-      <w:r>
-        <w:rPr>
-          <w:rFonts w:asciiTheme="minorHAnsi" w:eastAsiaTheme="minorHAnsi" w:hAnsiTheme="minorHAnsi" w:cstheme="minorBidi"/>
-          <w:kern w:val="2"/>
-          <w:sz w:val="24"/>
-          <w:szCs w:val="24"/>
-          <w14:ligatures w14:val="standardContextual"/>
-        </w:rPr>
-        <w:t>de forma mansa e pacífica, desde</w:t>
-      </w:r>
-      <w:r>
-        <w:rPr>
-          <w:rFonts w:asciiTheme="minorHAnsi" w:eastAsiaTheme="minorHAnsi" w:hAnsiTheme="minorHAnsi" w:cstheme="minorBidi"/>
-          <w:kern w:val="2"/>
-          <w:sz w:val="24"/>
-          <w:szCs w:val="24"/>
-          <w:lang w:val="pt-BR"/>
-          <w14:ligatures w14:val="standardContextual"/>
-        </w:rPr>
-        <w:t xml:space="preserve"> {{Inicio_permanencia}}</w:t>
+          <w:lang w:val="pt-BR"/>
+          <w14:ligatures w14:val="standardContextual"/>
+        </w:rPr>
+        <w:t>{{Complemento}}</w:t>
       </w:r>
       <w:r>
         <w:rPr>
@@ -275,6 +210,45 @@
           <w14:ligatures w14:val="standardContextual"/>
         </w:rPr>
         <w:t>.</w:t>
+      </w:r>
+    </w:p>
+    <w:p>
+      <w:pPr>
+        <w:ind w:firstLine="708"/>
+        <w:jc w:val="both"/>
+      </w:pPr>
+      <w:r>
+        <w:t>A presente declaração destina-se exclusivamente à instrução de procedimentos administrativos em projeto de energia solar.</w:t>
+      </w:r>
+    </w:p>
+    <w:p>
+      <w:pPr>
+        <w:ind w:firstLine="708"/>
+        <w:jc w:val="both"/>
+      </w:pPr>
+    </w:p>
+    <w:p>
+      <w:pPr>
+        <w:ind w:firstLine="708"/>
+        <w:jc w:val="both"/>
+      </w:pPr>
+      <w:r>
+        <w:t>Declaro, ainda, que as informações aqui prestadas são de minha inteira responsabilidade.</w:t>
+      </w:r>
+    </w:p>
+    <w:p>
+      <w:pPr>
+        <w:ind w:firstLine="708"/>
+        <w:jc w:val="both"/>
+      </w:pPr>
+    </w:p>
+    <w:p>
+      <w:pPr>
+        <w:ind w:firstLine="708"/>
+        <w:jc w:val="both"/>
+      </w:pPr>
+      <w:r>
+        <w:t>Por ser expressão da verdade, firmo a presente declaração.</w:t>
       </w:r>
     </w:p>
     <w:p>
@@ -289,21 +263,9 @@
           <w:kern w:val="2"/>
           <w:sz w:val="24"/>
           <w:szCs w:val="24"/>
-          <w:lang w:val="pt-BR"/>
-          <w14:ligatures w14:val="standardContextual"/>
-        </w:rPr>
-      </w:pPr>
-      <w:r>
-        <w:rPr>
-          <w:rFonts w:asciiTheme="minorHAnsi" w:eastAsiaTheme="minorHAnsi" w:hAnsiTheme="minorHAnsi" w:cstheme="minorBidi"/>
-          <w:kern w:val="2"/>
-          <w:sz w:val="24"/>
-          <w:szCs w:val="24"/>
-          <w:lang w:val="pt-BR"/>
-          <w14:ligatures w14:val="standardContextual"/>
-        </w:rPr>
-        <w:t>Declaro, ainda, que sou o responsável legal pelo uso e manutenção do referido imóvel.</w:t>
-      </w:r>
+          <w14:ligatures w14:val="standardContextual"/>
+        </w:rPr>
+      </w:pPr>
     </w:p>
     <w:p>
       <w:pPr>
@@ -315,62 +277,12 @@
         <w:rPr>
           <w:rFonts w:asciiTheme="minorHAnsi" w:eastAsiaTheme="minorHAnsi" w:hAnsiTheme="minorHAnsi" w:cstheme="minorBidi"/>
           <w:kern w:val="2"/>
-          <w:lang w:val="pt-BR"/>
-          <w14:ligatures w14:val="standardContextual"/>
-        </w:rPr>
-      </w:pPr>
-      <w:r>
-        <w:rPr>
-          <w:rFonts w:asciiTheme="minorHAnsi" w:eastAsiaTheme="minorHAnsi" w:hAnsiTheme="minorHAnsi" w:cstheme="minorBidi"/>
-          <w:kern w:val="2"/>
-          <w:sz w:val="24"/>
-          <w:szCs w:val="24"/>
-          <w14:ligatures w14:val="standardContextual"/>
-        </w:rPr>
-        <w:t>Apresento, juntamente a esta declaração, o documento</w:t>
-      </w:r>
-      <w:r>
-        <w:rPr>
-          <w:rFonts w:asciiTheme="minorHAnsi" w:eastAsiaTheme="minorHAnsi" w:hAnsiTheme="minorHAnsi" w:cstheme="minorBidi"/>
-          <w:kern w:val="2"/>
-          <w:sz w:val="24"/>
-          <w:szCs w:val="24"/>
-          <w:lang w:val="pt-BR"/>
-          <w14:ligatures w14:val="standardContextual"/>
-        </w:rPr>
-        <w:t xml:space="preserve"> </w:t>
-      </w:r>
-      <w:r>
-        <w:rPr>
-          <w:rFonts w:asciiTheme="minorHAnsi" w:eastAsiaTheme="minorHAnsi" w:hAnsiTheme="minorHAnsi" w:cstheme="minorBidi"/>
-          <w:kern w:val="2"/>
-          <w:sz w:val="24"/>
-          <w:szCs w:val="24"/>
-          <w:lang w:val="pt-BR"/>
-          <w14:ligatures w14:val="standardContextual"/>
-        </w:rPr>
-        <w:t>{{CPF_proprietario}}</w:t>
-      </w:r>
-      <w:r>
-        <w:rPr>
-          <w:rFonts w:asciiTheme="minorHAnsi" w:eastAsiaTheme="minorHAnsi" w:hAnsiTheme="minorHAnsi" w:cstheme="minorBidi"/>
-          <w:kern w:val="2"/>
-          <w:sz w:val="24"/>
-          <w:szCs w:val="24"/>
-          <w:lang w:val="pt-BR"/>
-          <w14:ligatures w14:val="standardContextual"/>
-        </w:rPr>
-        <w:t xml:space="preserve"> </w:t>
-      </w:r>
-      <w:r>
-        <w:rPr>
-          <w:rFonts w:asciiTheme="minorHAnsi" w:eastAsiaTheme="minorHAnsi" w:hAnsiTheme="minorHAnsi" w:cstheme="minorBidi"/>
-          <w:kern w:val="2"/>
-          <w:lang w:val="pt-BR"/>
-          <w14:ligatures w14:val="standardContextual"/>
-        </w:rPr>
-        <w:t>para demonstrar o meu vínculo com o local.</w:t>
-      </w:r>
+          <w:sz w:val="24"/>
+          <w:szCs w:val="24"/>
+          <w:lang w:val="pt-BR"/>
+          <w14:ligatures w14:val="standardContextual"/>
+        </w:rPr>
+      </w:pPr>
     </w:p>
     <w:p>
       <w:pPr>
@@ -388,17 +300,6 @@
           <w14:ligatures w14:val="standardContextual"/>
         </w:rPr>
       </w:pPr>
-      <w:r>
-        <w:rPr>
-          <w:rFonts w:asciiTheme="minorHAnsi" w:eastAsiaTheme="minorHAnsi" w:hAnsiTheme="minorHAnsi" w:cstheme="minorBidi"/>
-          <w:kern w:val="2"/>
-          <w:sz w:val="24"/>
-          <w:szCs w:val="24"/>
-          <w:lang w:val="pt-BR"/>
-          <w14:ligatures w14:val="standardContextual"/>
-        </w:rPr>
-        <w:t>Por ser a expressão da verdade, firmo a presente.</w:t>
-      </w:r>
     </w:p>
     <w:p>
       <w:pPr>
@@ -406,40 +307,6 @@
         <w:autoSpaceDE/>
         <w:autoSpaceDN/>
         <w:spacing w:after="160" w:line="278" w:lineRule="auto"/>
-        <w:jc w:val="both"/>
-        <w:rPr>
-          <w:rFonts w:asciiTheme="minorHAnsi" w:eastAsiaTheme="minorHAnsi" w:hAnsiTheme="minorHAnsi" w:cstheme="minorBidi"/>
-          <w:kern w:val="2"/>
-          <w:sz w:val="24"/>
-          <w:szCs w:val="24"/>
-          <w:lang w:val="pt-BR"/>
-          <w14:ligatures w14:val="standardContextual"/>
-        </w:rPr>
-      </w:pPr>
-    </w:p>
-    <w:p>
-      <w:pPr>
-        <w:widowControl/>
-        <w:autoSpaceDE/>
-        <w:autoSpaceDN/>
-        <w:spacing w:after="160" w:line="278" w:lineRule="auto"/>
-        <w:jc w:val="both"/>
-        <w:rPr>
-          <w:rFonts w:asciiTheme="minorHAnsi" w:eastAsiaTheme="minorHAnsi" w:hAnsiTheme="minorHAnsi" w:cstheme="minorBidi"/>
-          <w:kern w:val="2"/>
-          <w:sz w:val="24"/>
-          <w:szCs w:val="24"/>
-          <w:lang w:val="pt-BR"/>
-          <w14:ligatures w14:val="standardContextual"/>
-        </w:rPr>
-      </w:pPr>
-    </w:p>
-    <w:p>
-      <w:pPr>
-        <w:widowControl/>
-        <w:autoSpaceDE/>
-        <w:autoSpaceDN/>
-        <w:spacing w:after="160" w:line="278" w:lineRule="auto"/>
         <w:jc w:val="center"/>
         <w:rPr>
           <w:rFonts w:asciiTheme="minorHAnsi" w:eastAsiaTheme="minorHAnsi" w:hAnsiTheme="minorHAnsi" w:cstheme="minorBidi"/>
@@ -541,7 +408,7 @@
         <mc:AlternateContent>
           <mc:Choice Requires="wps">
             <w:drawing>
-              <wp:anchor distT="0" distB="0" distL="114300" distR="114300" simplePos="0" relativeHeight="251659264" behindDoc="0" locked="0" layoutInCell="1" allowOverlap="1" wp14:anchorId="1C9F9E0D" wp14:editId="102D241E">
+              <wp:anchor distT="0" distB="0" distL="114300" distR="114300" simplePos="0" relativeHeight="251659264" behindDoc="0" locked="0" layoutInCell="1" allowOverlap="1" wp14:anchorId="1C9F9E0D" wp14:editId="46AB4BC2">
                 <wp:simplePos x="0" y="0"/>
                 <wp:positionH relativeFrom="margin">
                   <wp:align>center</wp:align>
@@ -595,7 +462,7 @@
           </mc:Choice>
           <mc:Fallback>
             <w:pict>
-              <v:line w14:anchorId="7B709E02" id="Conector reto 1" o:spid="_x0000_s1026" style="position:absolute;z-index:251659264;visibility:visible;mso-wrap-style:square;mso-wrap-distance-left:9pt;mso-wrap-distance-top:0;mso-wrap-distance-right:9pt;mso-wrap-distance-bottom:0;mso-position-horizontal:center;mso-position-horizontal-relative:margin;mso-position-vertical:absolute;mso-position-vertical-relative:text" from="0,.7pt" to="181.8pt,.7pt" o:gfxdata="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" strokecolor="black [3213]" strokeweight=".25pt">
+              <v:line w14:anchorId="454F1EB4" id="Conector reto 1" o:spid="_x0000_s1026" style="position:absolute;z-index:251659264;visibility:visible;mso-wrap-style:square;mso-wrap-distance-left:9pt;mso-wrap-distance-top:0;mso-wrap-distance-right:9pt;mso-wrap-distance-bottom:0;mso-position-horizontal:center;mso-position-horizontal-relative:margin;mso-position-vertical:absolute;mso-position-vertical-relative:text" from="0,.7pt" to="181.8pt,.7pt" o:gfxdata="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" strokecolor="black [3213]" strokeweight=".25pt">
                 <v:shadow on="t" color="black" opacity="24903f" origin=",.5" offset="0,.55556mm"/>
                 <w10:wrap anchorx="margin"/>
               </v:line>
@@ -604,31 +471,22 @@
         </mc:AlternateContent>
       </w:r>
       <w:r>
-        <w:t>Assinatura</w:t>
-      </w:r>
-    </w:p>
-    <w:p>
-      <w:pPr>
-        <w:jc w:val="center"/>
-        <w:rPr>
-          <w:b/>
-          <w:bCs/>
-          <w:sz w:val="20"/>
-          <w:szCs w:val="20"/>
-          <w:u w:val="single"/>
-        </w:rPr>
-      </w:pPr>
-      <w:r>
-        <w:rPr>
-          <w:b/>
-          <w:bCs/>
-          <w:sz w:val="20"/>
-          <w:szCs w:val="20"/>
-        </w:rPr>
-        <w:t>Conforme documento original</w:t>
-      </w:r>
-    </w:p>
-    <w:p/>
+        <w:t>ASSINATURA DO DECLARANTE</w:t>
+      </w:r>
+    </w:p>
+    <w:p>
+      <w:pPr>
+        <w:jc w:val="center"/>
+      </w:pPr>
+      <w:r>
+        <w:t>Gov ou Cartório</w:t>
+      </w:r>
+    </w:p>
+    <w:p>
+      <w:pPr>
+        <w:jc w:val="center"/>
+      </w:pPr>
+    </w:p>
     <w:sectPr>
       <w:pgSz w:w="11906" w:h="16838"/>
       <w:pgMar w:top="1417" w:right="1701" w:bottom="1417" w:left="1701" w:header="708" w:footer="708" w:gutter="0"/>

</xml_diff>